<commit_message>
Refocus portfolio for analyst roles
</commit_message>
<xml_diff>
--- a/Enrico_Alagao_Resume.docx
+++ b/Enrico_Alagao_Resume.docx
@@ -23,7 +23,7 @@
           <w:color w:val="0F766E"/>
           <w:sz w:val="21"/>
         </w:rPr>
-        <w:t>Data Analyst / Data Scientist | Open to QA and Data Roles</w:t>
+        <w:t>Data Analyst | Business Analyst</w:t>
       </w:r>
     </w:p>
     <w:p>
@@ -64,7 +64,11 @@
         <w:spacing w:after="80"/>
       </w:pPr>
       <w:r>
-        <w:t>Data Analyst with hands-on experience turning raw data into clean, reliable datasets and translating it into dashboards, reports, and business insights. Proficient in SQL and Python for data cleaning, validation, and exploratory analysis, with working knowledge of ETL and data modeling. Open to QA roles and eager to learn: a fast self-learner ready to be trained and to pick up new tools and domains.</w:t>
+        <w:t>Data Analyst and Business Analyst focused on turning raw data into dashboards, reports, KPI tracking, and decisions for non-technical stakeholders.</w:t>
+        <w:br/>
+        <w:t>Experienced in SQL and Python for data cleaning, validation, EDA, and trend analysis, with reporting work in Apache Superset, Databricks, and Snowflake.</w:t>
+        <w:br/>
+        <w:t>Communicates findings clearly through stakeholder presentations, business insight summaries, and recommendation-focused reporting.</w:t>
       </w:r>
     </w:p>
     <w:p>
@@ -112,7 +116,7 @@
                 <w:color w:val="5B6678"/>
                 <w:sz w:val="17"/>
               </w:rPr>
-              <w:t>Languages</w:t>
+              <w:t>SQL</w:t>
             </w:r>
           </w:p>
         </w:tc>
@@ -133,7 +137,7 @@
                 <w:color w:val="111827"/>
                 <w:sz w:val="17"/>
               </w:rPr>
-              <w:t>Python, SQL (PostgreSQL, Spark SQL)</w:t>
+              <w:t>PostgreSQL, Spark SQL</w:t>
             </w:r>
           </w:p>
         </w:tc>
@@ -160,7 +164,7 @@
                 <w:color w:val="5B6678"/>
                 <w:sz w:val="17"/>
               </w:rPr>
-              <w:t>ETL and Data Engineering</w:t>
+              <w:t>Python</w:t>
             </w:r>
           </w:p>
         </w:tc>
@@ -181,7 +185,7 @@
                 <w:color w:val="111827"/>
                 <w:sz w:val="17"/>
               </w:rPr>
-              <w:t xml:space="preserve">ETL concepts, data extraction and transformation, data modeling, pipeline orchestration </w:t>
+              <w:t>Pandas, NumPy, Matplotlib, Seaborn</w:t>
             </w:r>
           </w:p>
         </w:tc>
@@ -229,7 +233,7 @@
                 <w:color w:val="111827"/>
                 <w:sz w:val="17"/>
               </w:rPr>
-              <w:t>Pandas, NumPy, Matplotlib, Seaborn, data cleaning and validation, EDA, statistical analysis</w:t>
+              <w:t>Data cleaning and validation, EDA, trend analysis, data quality checks</w:t>
             </w:r>
           </w:p>
         </w:tc>
@@ -277,7 +281,7 @@
                 <w:color w:val="111827"/>
                 <w:sz w:val="17"/>
               </w:rPr>
-              <w:t>Dashboard development, stakeholder reporting, data visualization, business insight generation</w:t>
+              <w:t>Apache Superset, dashboard development, KPI reporting, stakeholder reporting</w:t>
             </w:r>
           </w:p>
         </w:tc>
@@ -304,7 +308,7 @@
                 <w:color w:val="5B6678"/>
                 <w:sz w:val="17"/>
               </w:rPr>
-              <w:t>Quality Assurance</w:t>
+              <w:t>Data Platforms</w:t>
             </w:r>
           </w:p>
         </w:tc>
@@ -325,7 +329,7 @@
                 <w:color w:val="111827"/>
                 <w:sz w:val="17"/>
               </w:rPr>
-              <w:t>Data validation, data quality checks, reconciliation, issue reporting and documentation</w:t>
+              <w:t>Databricks, Snowflake, Jupyter Notebook</w:t>
             </w:r>
           </w:p>
         </w:tc>
@@ -352,7 +356,7 @@
                 <w:color w:val="5B6678"/>
                 <w:sz w:val="17"/>
               </w:rPr>
-              <w:t>Data Platforms and Tools</w:t>
+              <w:t>Business Analysis</w:t>
             </w:r>
           </w:p>
         </w:tc>
@@ -368,20 +372,12 @@
             <w:vAlign w:val="center"/>
           </w:tcPr>
           <w:p>
-            <w:r>
-              <w:rPr>
-                <w:color w:val="111827"/>
-                <w:sz w:val="17"/>
-              </w:rPr>
-              <w:t xml:space="preserve">Databricks, Delta Lake, PostgreSQL, Snowflake, Apache Superset, </w:t>
-            </w:r>
             <w:proofErr w:type="spellStart"/>
             <w:r>
               <w:rPr>
                 <w:color w:val="111827"/>
                 <w:sz w:val="17"/>
               </w:rPr>
-              <w:t>Jupyter</w:t>
             </w:r>
             <w:proofErr w:type="spellEnd"/>
             <w:r>
@@ -389,7 +385,13 @@
                 <w:color w:val="111827"/>
                 <w:sz w:val="17"/>
               </w:rPr>
-              <w:t xml:space="preserve"> Notebook</w:t>
+            </w:r>
+            <w:r>
+              <w:rPr>
+                <w:color w:val="111827"/>
+                <w:sz w:val="17"/>
+              </w:rPr>
+              <w:t>Stakeholder communication, business insight generation, recommendation-focused reporting</w:t>
             </w:r>
           </w:p>
         </w:tc>
@@ -442,7 +444,7 @@
         <w:ind w:left="259" w:hanging="259"/>
       </w:pPr>
       <w:r>
-        <w:t>Extract, transform, and load (ETL) data using SQL and Python to clean, validate, and prepare analysis-ready datasets.</w:t>
+        <w:t>Built dashboards and reports for stakeholder reporting, resulting in clearer KPI tracking and faster review of business trends.</w:t>
       </w:r>
     </w:p>
     <w:p>
@@ -452,7 +454,19 @@
         <w:ind w:left="259" w:hanging="259"/>
       </w:pPr>
       <w:r>
-        <w:t>Analyze large datasets to identify trends and patterns and translate findings into business insights.</w:t>
+        <w:t>Delivered SQL and Python data cleaning, validation, and analysis for operational datasets, resulting in more reliable reporting inputs and fewer data quality issues.</w:t>
+      </w:r>
+    </w:p>
+    <w:p>
+      <w:pPr>
+        <w:pStyle w:val="ListBullet"/>
+        <w:spacing w:after="20"/>
+        <w:ind w:left="259" w:hanging="259"/>
+      </w:pPr>
+      <w:r/>
+      <w:r/>
+      <w:r>
+        <w:t>Analyzed large datasets for trend analysis and business insights, resulting in findings stakeholders could use for planning, monitoring, and process review.</w:t>
       </w:r>
     </w:p>
     <w:p>
@@ -462,23 +476,7 @@
         <w:ind w:left="259" w:hanging="259"/>
       </w:pPr>
       <w:r>
-        <w:t xml:space="preserve">Build and maintain dashboards and reports using Databricks, </w:t>
-      </w:r>
-      <w:r>
-        <w:t>Snowflake</w:t>
-      </w:r>
-      <w:r>
-        <w:t>, and Apache Superset.</w:t>
-      </w:r>
-    </w:p>
-    <w:p>
-      <w:pPr>
-        <w:pStyle w:val="ListBullet"/>
-        <w:spacing w:after="20"/>
-        <w:ind w:left="259" w:hanging="259"/>
-      </w:pPr>
-      <w:r>
-        <w:t>Collaborate with stakeholders and present technical findings in plain language.</w:t>
+        <w:t>Presented dashboard findings and technical analysis to stakeholders in plain language, resulting in clearer decisions around performance, reporting needs, and next steps.</w:t>
       </w:r>
     </w:p>
     <w:p>
@@ -526,7 +524,7 @@
         <w:ind w:left="259" w:hanging="259"/>
       </w:pPr>
       <w:r>
-        <w:t>Developed new modules for existing enterprise systems using C# within an MVC framework.</w:t>
+        <w:t>Supported enterprise system updates using C# and MVC during internship work.</w:t>
       </w:r>
     </w:p>
     <w:p>
@@ -554,13 +552,12 @@
       <w:r>
         <w:rPr>
           <w:i/>
-          <w:color w:val="5B6678"/>
           <w:sz w:val="17"/>
         </w:rPr>
         <w:t xml:space="preserve"> (Work sample) </w:t>
       </w:r>
       <w:r>
-        <w:t>Dashboard-style station utilization and operational flow analysis highlighting Espresso as the most utilized station.</w:t>
+        <w:t>Analyzed station utilization to identify Espresso as the most utilized station; recommended monitoring peak periods and balancing support around high-use stations.</w:t>
       </w:r>
     </w:p>
     <w:p>
@@ -568,29 +565,22 @@
         <w:spacing w:after="20"/>
       </w:pPr>
       <w:proofErr w:type="spellStart"/>
-      <w:r>
-        <w:rPr>
-          <w:b/>
-        </w:rPr>
-        <w:t>Komunitree</w:t>
-      </w:r>
       <w:proofErr w:type="spellEnd"/>
       <w:r>
         <w:rPr>
           <w:b/>
         </w:rPr>
-        <w:t xml:space="preserve"> Analytics Dashboard</w:t>
+        <w:t>Komunitree Analytics Dashboard</w:t>
       </w:r>
       <w:r>
         <w:rPr>
           <w:i/>
-          <w:color w:val="5B6678"/>
           <w:sz w:val="17"/>
         </w:rPr>
         <w:t xml:space="preserve"> (Work sample) </w:t>
       </w:r>
       <w:r>
-        <w:t>Interactive analytics view combining ranked entities, map context, distributions, timelines, and detail tables.</w:t>
+        <w:t>Built a dashboard view connecting map context, ranked entities, category mix, timelines, and detail tables; recommended using map clusters and drill-down records to prioritize validation and follow-up.</w:t>
       </w:r>
     </w:p>
     <w:p>
@@ -599,21 +589,19 @@
       </w:pPr>
       <w:r>
         <w:rPr>
-          <w:rStyle w:val="Strong"/>
+          <w:b/>
         </w:rPr>
         <w:t>Loan Data Analysis</w:t>
       </w:r>
       <w:r>
-        <w:t xml:space="preserve"> </w:t>
+        <w:rPr>
+          <w:i/>
+          <w:sz w:val="17"/>
+        </w:rPr>
+        <w:t xml:space="preserve"> (Work sample) </w:t>
       </w:r>
       <w:r>
-        <w:rPr>
-          <w:rStyle w:val="Emphasis"/>
-        </w:rPr>
-        <w:t>(Work Sample)</w:t>
-      </w:r>
-      <w:r>
-        <w:t xml:space="preserve"> — Conducted exploratory data analysis (EDA) on loan data to identify trends, patterns, and key insights related to loan applications, approvals, repayments, and customer behavior. Analyzed data distributions and trends to support data-driven decision-making for a lending firm.</w:t>
+        <w:t>Analyzed 18,782 loan outcomes with a 91.3% approval rate and PHP 906.3M approved; recommended monitoring demand spikes, cancellations, and branch-level approval patterns to support lending decisions.</w:t>
       </w:r>
     </w:p>
     <w:p>

</xml_diff>